<commit_message>
docs: hand over via the public GitHub repository instead of a zip
Co-Authored-By: Claude Opus 5.5 <noreply@anthropic.com>
</commit_message>
<xml_diff>
--- a/docs/IITG-TIC-Handover.docx
+++ b/docs/IITG-TIC-Handover.docx
@@ -152,7 +152,7 @@
           <w:sz w:val="22"/>
           <w:szCs w:val="22"/>
         </w:rPr>
-        <w:t xml:space="preserve">We hereby hand over the complete source code of the IITG-TIC website, developed by us, to IIT Guwahati Technology Incubation Centre. The handover is made as a single zip file, IITG-TIC-Website.zip, which is a clone of the project’s GitHub repository (main branch, build v36). The same code is public at https://github.com/Machahary07/frontend-iitgtic and can be cloned directly from there.</w:t>
+        <w:t xml:space="preserve">We hereby hand over the complete source code of the IITG-TIC website, developed by us, to IIT Guwahati Technology Incubation Centre. The code is handed over through its public GitHub repository, https://github.com/Machahary07/frontend-iitgtic (main branch, build v36), from which it can be cloned or downloaded at any time.</w:t>
       </w:r>
     </w:p>
     <w:p>
@@ -168,7 +168,7 @@
           <w:sz w:val="22"/>
           <w:szCs w:val="22"/>
         </w:rPr>
-        <w:t xml:space="preserve">1. Contents of the zip file</w:t>
+        <w:t xml:space="preserve">1. Contents of the repository</w:t>
       </w:r>
     </w:p>
     <w:p>

</xml_diff>

<commit_message>
Remove /status; bring README, manual and handover up to date
- Delete the /status build checklist and its links; robots keeps it under the gone URLs.
- README: reject rules, reapply wait and override endpoint, score locks, team rejection
  email, hidden developer activity, clearing logs.
- Admin manual (build v40): drop Chairman/President, same review and Activity changes;
  PDF rebuilt. Handover note: build v40, 21 tables.

Co-Authored-By: Claude Opus 5.5 <noreply@anthropic.com>
</commit_message>
<xml_diff>
--- a/docs/IITG-TIC-Handover.docx
+++ b/docs/IITG-TIC-Handover.docx
@@ -93,7 +93,7 @@
           <w:sz w:val="22"/>
           <w:szCs w:val="22"/>
         </w:rPr>
-        <w:t xml:space="preserve">9 October 2026</w:t>
+        <w:t xml:space="preserve">23 October 2026</w:t>
       </w:r>
     </w:p>
     <w:p>
@@ -152,7 +152,7 @@
           <w:sz w:val="22"/>
           <w:szCs w:val="22"/>
         </w:rPr>
-        <w:t xml:space="preserve">We hereby hand over the complete source code of the IITG-TIC website, developed by us, to IIT Guwahati Technology Incubation Centre. The code is handed over through its public GitHub repository, https://github.com/Machahary07/frontend-iitgtic (main branch, build v38), from which it can be cloned or downloaded at any time.</w:t>
+        <w:t xml:space="preserve">We hereby hand over the complete source code of the IITG-TIC website, developed by us, to IIT Guwahati Technology Incubation Centre. The code is handed over through its public GitHub repository, https://github.com/Machahary07/frontend-iitgtic (main branch, build v40), from which it can be cloned or downloaded at any time.</w:t>
       </w:r>
     </w:p>
     <w:p>
@@ -224,7 +224,7 @@
           <w:sz w:val="22"/>
           <w:szCs w:val="22"/>
         </w:rPr>
-        <w:t xml:space="preserve">— the complete database: 20 tables, access rules, triggers and four storage buckets.</w:t>
+        <w:t xml:space="preserve">— the complete database: 21 tables, access rules, triggers and four storage buckets.</w:t>
       </w:r>
     </w:p>
     <w:p>

</xml_diff>